<commit_message>
docs: agregar evidencias de la actividad autonoma 07
</commit_message>
<xml_diff>
--- a/docs/Informe_Guia_Practica_07_PharmaMobile.docx
+++ b/docs/Informe_Guia_Practica_07_PharmaMobile.docx
@@ -364,7 +364,7 @@
                 <w:rFonts w:ascii="Aptos" w:hAnsi="Aptos"/>
                 <w:sz w:val="21"/>
               </w:rPr>
-              <w:t>4 de octubre de 2026</w:t>
+              <w:t>29 de septiembre de 2026</w:t>
             </w:r>
           </w:p>
         </w:tc>
@@ -420,7 +420,7 @@
           <w:rFonts w:ascii="Aptos" w:hAnsi="Aptos"/>
           <w:sz w:val="21"/>
         </w:rPr>
-        <w:t>La verificación del 4 de octubre de 2026 confirmó que PharmaSoft respondió correctamente, que el emulador Android mostró los tres productos creados y que la aplicación presentó un estado de error controlado al perder la conexión. La ejecución iOS no se realizó porque el entorno disponible es Windows y no se cuenta con macOS ni Xcode.</w:t>
+        <w:t>La verificación del 29 de septiembre de 2026 confirmó que PharmaSoft respondió correctamente, que el emulador Android mostró los tres productos creados y que la aplicación presentó un estado de error controlado al perder la conexión. La ejecución iOS no se realizó porque el entorno disponible es Windows y no se cuenta con macOS ni Xcode.</w:t>
       </w:r>
     </w:p>
     <w:p>

</xml_diff>